<commit_message>
Add live links to the Abu Hani call script
External links to the Masar claim evidence sheet, the evidence folder,
the forms BF-R03, R04, T10, T11, T14, T22, T24 and T25, both call notes
with Dr. Ahlia, the June 2026 audit report and the live dashboard.
Internal links for the section cross references. A sources list closes
the numbers card. Rendered PDF now 12 pages.

Co-Authored-By: Claude Fable 5.1 <noreply@anthropic.com>
Claude-Session: https://claude.ai/code/session_017eZYi1XPB4J36Bs7Pd5TwY
</commit_message>
<xml_diff>
--- a/Abu Hani Call Script 10.11.2026.docx
+++ b/Abu Hani Call Script 10.11.2026.docx
@@ -250,7 +250,27 @@
           <w:sz w:val="22"/>
           <w:szCs w:val="22"/>
         </w:rPr>
-        <w:t xml:space="preserve">Do not say that Bukrah will find another partner. Dr. Ahlia and you agreed on 10/08 to hold that line in reserve.</w:t>
+        <w:t xml:space="preserve">Do not say that Bukrah will find another partner. Dr. Ahlia and you </w:t>
+      </w:r>
+      <w:hyperlink w:history="1" r:id="rIdko4zt0t9lrswk0b8mxftc">
+        <w:r>
+          <w:rPr>
+            <w:rFonts w:ascii="Times New Roman" w:cs="Times New Roman" w:eastAsia="Times New Roman" w:hAnsi="Times New Roman"/>
+            <w:color w:val="0563C1"/>
+            <w:sz w:val="22"/>
+            <w:szCs w:val="22"/>
+            <w:u w:val="single"/>
+          </w:rPr>
+          <w:t xml:space="preserve">agreed on 10/08</w:t>
+        </w:r>
+      </w:hyperlink>
+      <w:r>
+        <w:rPr>
+          <w:rFonts w:ascii="Times New Roman" w:cs="Times New Roman" w:eastAsia="Times New Roman" w:hAnsi="Times New Roman"/>
+          <w:sz w:val="22"/>
+          <w:szCs w:val="22"/>
+        </w:rPr>
+        <w:t xml:space="preserve"> to hold that line in reserve.</w:t>
       </w:r>
     </w:p>
     <w:p>
@@ -429,7 +449,67 @@
           <w:sz w:val="22"/>
           <w:szCs w:val="22"/>
         </w:rPr>
-        <w:t xml:space="preserve">Have open on screen: the Masar claim evidence sheet of 10/05, Masar's 10/02 debt statement and cover letter, the October water log photo, and the numbers card in section 7 of this script.</w:t>
+        <w:t xml:space="preserve">Have open on screen: the </w:t>
+      </w:r>
+      <w:hyperlink w:history="1" r:id="rId6nh2qptq8adezo7gd2hef">
+        <w:r>
+          <w:rPr>
+            <w:rFonts w:ascii="Times New Roman" w:cs="Times New Roman" w:eastAsia="Times New Roman" w:hAnsi="Times New Roman"/>
+            <w:color w:val="0563C1"/>
+            <w:sz w:val="22"/>
+            <w:szCs w:val="22"/>
+            <w:u w:val="single"/>
+          </w:rPr>
+          <w:t xml:space="preserve">Masar claim evidence sheet of 10/05</w:t>
+        </w:r>
+      </w:hyperlink>
+      <w:r>
+        <w:rPr>
+          <w:rFonts w:ascii="Times New Roman" w:cs="Times New Roman" w:eastAsia="Times New Roman" w:hAnsi="Times New Roman"/>
+          <w:sz w:val="22"/>
+          <w:szCs w:val="22"/>
+        </w:rPr>
+        <w:t xml:space="preserve">, Masar's </w:t>
+      </w:r>
+      <w:hyperlink w:history="1" r:id="rIdsg0gqunrqn5ok1pf7sygp">
+        <w:r>
+          <w:rPr>
+            <w:rFonts w:ascii="Times New Roman" w:cs="Times New Roman" w:eastAsia="Times New Roman" w:hAnsi="Times New Roman"/>
+            <w:color w:val="0563C1"/>
+            <w:sz w:val="22"/>
+            <w:szCs w:val="22"/>
+            <w:u w:val="single"/>
+          </w:rPr>
+          <w:t xml:space="preserve">10/02 debt statement and cover letter</w:t>
+        </w:r>
+      </w:hyperlink>
+      <w:r>
+        <w:rPr>
+          <w:rFonts w:ascii="Times New Roman" w:cs="Times New Roman" w:eastAsia="Times New Roman" w:hAnsi="Times New Roman"/>
+          <w:sz w:val="22"/>
+          <w:szCs w:val="22"/>
+        </w:rPr>
+        <w:t xml:space="preserve">, the October water log photo in the same folder, and the </w:t>
+      </w:r>
+      <w:hyperlink w:history="1" w:anchor="sec7">
+        <w:r>
+          <w:rPr>
+            <w:rFonts w:ascii="Times New Roman" w:cs="Times New Roman" w:eastAsia="Times New Roman" w:hAnsi="Times New Roman"/>
+            <w:color w:val="0563C1"/>
+            <w:sz w:val="22"/>
+            <w:szCs w:val="22"/>
+            <w:u w:val="single"/>
+          </w:rPr>
+          <w:t xml:space="preserve">numbers card in section 7</w:t>
+        </w:r>
+      </w:hyperlink>
+      <w:r>
+        <w:rPr>
+          <w:rFonts w:ascii="Times New Roman" w:cs="Times New Roman" w:eastAsia="Times New Roman" w:hAnsi="Times New Roman"/>
+          <w:sz w:val="22"/>
+          <w:szCs w:val="22"/>
+        </w:rPr>
+        <w:t xml:space="preserve"> of this script.</w:t>
       </w:r>
     </w:p>
     <w:p>
@@ -450,7 +530,107 @@
           <w:sz w:val="22"/>
           <w:szCs w:val="22"/>
         </w:rPr>
-        <w:t xml:space="preserve">Have ready to send in the group right after the call: BF-R03 Purchase Evidence Rule, BF-T14 Photo Documentation Log version 2.0, BF-T11 Daily Water Delivery Log, BF-T24 Social Media Account Declaration, and BF-R04 Vetting Form Signature and Date Guide.</w:t>
+        <w:t xml:space="preserve">Have ready to send in the group right after the call: </w:t>
+      </w:r>
+      <w:hyperlink w:history="1" r:id="rIdsghkl5e3a6oj7cal509rx">
+        <w:r>
+          <w:rPr>
+            <w:rFonts w:ascii="Times New Roman" w:cs="Times New Roman" w:eastAsia="Times New Roman" w:hAnsi="Times New Roman"/>
+            <w:color w:val="0563C1"/>
+            <w:sz w:val="22"/>
+            <w:szCs w:val="22"/>
+            <w:u w:val="single"/>
+          </w:rPr>
+          <w:t xml:space="preserve">BF-R03 Purchase Evidence Rule</w:t>
+        </w:r>
+      </w:hyperlink>
+      <w:r>
+        <w:rPr>
+          <w:rFonts w:ascii="Times New Roman" w:cs="Times New Roman" w:eastAsia="Times New Roman" w:hAnsi="Times New Roman"/>
+          <w:sz w:val="22"/>
+          <w:szCs w:val="22"/>
+        </w:rPr>
+        <w:t xml:space="preserve">, </w:t>
+      </w:r>
+      <w:hyperlink w:history="1" r:id="rId3nyfxjrp-jwrw-pznnxsj">
+        <w:r>
+          <w:rPr>
+            <w:rFonts w:ascii="Times New Roman" w:cs="Times New Roman" w:eastAsia="Times New Roman" w:hAnsi="Times New Roman"/>
+            <w:color w:val="0563C1"/>
+            <w:sz w:val="22"/>
+            <w:szCs w:val="22"/>
+            <w:u w:val="single"/>
+          </w:rPr>
+          <w:t xml:space="preserve">BF-T14 Photo Documentation Log version 2.0</w:t>
+        </w:r>
+      </w:hyperlink>
+      <w:r>
+        <w:rPr>
+          <w:rFonts w:ascii="Times New Roman" w:cs="Times New Roman" w:eastAsia="Times New Roman" w:hAnsi="Times New Roman"/>
+          <w:sz w:val="22"/>
+          <w:szCs w:val="22"/>
+        </w:rPr>
+        <w:t xml:space="preserve">, </w:t>
+      </w:r>
+      <w:hyperlink w:history="1" r:id="rId5gp2kgj4al2pn9idkn-pm">
+        <w:r>
+          <w:rPr>
+            <w:rFonts w:ascii="Times New Roman" w:cs="Times New Roman" w:eastAsia="Times New Roman" w:hAnsi="Times New Roman"/>
+            <w:color w:val="0563C1"/>
+            <w:sz w:val="22"/>
+            <w:szCs w:val="22"/>
+            <w:u w:val="single"/>
+          </w:rPr>
+          <w:t xml:space="preserve">BF-T11 Daily Water Delivery Log</w:t>
+        </w:r>
+      </w:hyperlink>
+      <w:r>
+        <w:rPr>
+          <w:rFonts w:ascii="Times New Roman" w:cs="Times New Roman" w:eastAsia="Times New Roman" w:hAnsi="Times New Roman"/>
+          <w:sz w:val="22"/>
+          <w:szCs w:val="22"/>
+        </w:rPr>
+        <w:t xml:space="preserve">, </w:t>
+      </w:r>
+      <w:hyperlink w:history="1" r:id="rIdbv2s6q-ylfzwxymqu_pgb">
+        <w:r>
+          <w:rPr>
+            <w:rFonts w:ascii="Times New Roman" w:cs="Times New Roman" w:eastAsia="Times New Roman" w:hAnsi="Times New Roman"/>
+            <w:color w:val="0563C1"/>
+            <w:sz w:val="22"/>
+            <w:szCs w:val="22"/>
+            <w:u w:val="single"/>
+          </w:rPr>
+          <w:t xml:space="preserve">BF-T24 Social Media Account Declaration</w:t>
+        </w:r>
+      </w:hyperlink>
+      <w:r>
+        <w:rPr>
+          <w:rFonts w:ascii="Times New Roman" w:cs="Times New Roman" w:eastAsia="Times New Roman" w:hAnsi="Times New Roman"/>
+          <w:sz w:val="22"/>
+          <w:szCs w:val="22"/>
+        </w:rPr>
+        <w:t xml:space="preserve">, and </w:t>
+      </w:r>
+      <w:hyperlink w:history="1" r:id="rIdfnvitqmfnhqjclkerqwz6">
+        <w:r>
+          <w:rPr>
+            <w:rFonts w:ascii="Times New Roman" w:cs="Times New Roman" w:eastAsia="Times New Roman" w:hAnsi="Times New Roman"/>
+            <w:color w:val="0563C1"/>
+            <w:sz w:val="22"/>
+            <w:szCs w:val="22"/>
+            <w:u w:val="single"/>
+          </w:rPr>
+          <w:t xml:space="preserve">BF-R04 Vetting Form Signature and Date Guide</w:t>
+        </w:r>
+      </w:hyperlink>
+      <w:r>
+        <w:rPr>
+          <w:rFonts w:ascii="Times New Roman" w:cs="Times New Roman" w:eastAsia="Times New Roman" w:hAnsi="Times New Roman"/>
+          <w:sz w:val="22"/>
+          <w:szCs w:val="22"/>
+        </w:rPr>
+        <w:t xml:space="preserve">.</w:t>
       </w:r>
     </w:p>
     <w:p>
@@ -492,7 +672,27 @@
           <w:sz w:val="22"/>
           <w:szCs w:val="22"/>
         </w:rPr>
-        <w:t xml:space="preserve">Keep a notes page open with the headings in section 8. Fill it during the call, not after.</w:t>
+        <w:t xml:space="preserve">Keep a notes page open with the </w:t>
+      </w:r>
+      <w:hyperlink w:history="1" w:anchor="sec8">
+        <w:r>
+          <w:rPr>
+            <w:rFonts w:ascii="Times New Roman" w:cs="Times New Roman" w:eastAsia="Times New Roman" w:hAnsi="Times New Roman"/>
+            <w:color w:val="0563C1"/>
+            <w:sz w:val="22"/>
+            <w:szCs w:val="22"/>
+            <w:u w:val="single"/>
+          </w:rPr>
+          <w:t xml:space="preserve">headings in section 8</w:t>
+        </w:r>
+      </w:hyperlink>
+      <w:r>
+        <w:rPr>
+          <w:rFonts w:ascii="Times New Roman" w:cs="Times New Roman" w:eastAsia="Times New Roman" w:hAnsi="Times New Roman"/>
+          <w:sz w:val="22"/>
+          <w:szCs w:val="22"/>
+        </w:rPr>
+        <w:t xml:space="preserve">. Fill it during the call, not after.</w:t>
       </w:r>
     </w:p>
     <w:p>
@@ -939,7 +1139,27 @@
           <w:sz w:val="22"/>
           <w:szCs w:val="22"/>
         </w:rPr>
-        <w:t xml:space="preserve">Write down each obstacle. You will match each one to a fix in Step 4.</w:t>
+        <w:t xml:space="preserve">Write down each obstacle. You will match each one to a fix in </w:t>
+      </w:r>
+      <w:hyperlink w:history="1" w:anchor="step4">
+        <w:r>
+          <w:rPr>
+            <w:rFonts w:ascii="Times New Roman" w:cs="Times New Roman" w:eastAsia="Times New Roman" w:hAnsi="Times New Roman"/>
+            <w:color w:val="0563C1"/>
+            <w:sz w:val="22"/>
+            <w:szCs w:val="22"/>
+            <w:u w:val="single"/>
+          </w:rPr>
+          <w:t xml:space="preserve">Step 4</w:t>
+        </w:r>
+      </w:hyperlink>
+      <w:r>
+        <w:rPr>
+          <w:rFonts w:ascii="Times New Roman" w:cs="Times New Roman" w:eastAsia="Times New Roman" w:hAnsi="Times New Roman"/>
+          <w:sz w:val="22"/>
+          <w:szCs w:val="22"/>
+        </w:rPr>
+        <w:t xml:space="preserve">.</w:t>
       </w:r>
     </w:p>
     <w:p>
@@ -1458,6 +1678,7 @@
         <w:widowControl/>
         <w:spacing w:after="100" w:before="0"/>
       </w:pPr>
+      <w:bookmarkStart w:name="step4" w:id="1"/>
       <w:r>
         <w:rPr>
           <w:rFonts w:ascii="Times New Roman" w:cs="Times New Roman" w:eastAsia="Times New Roman" w:hAnsi="Times New Roman"/>
@@ -1468,6 +1689,7 @@
         </w:rPr>
         <w:t xml:space="preserve">Step 4. The evidence routine, 10 minutes</w:t>
       </w:r>
+      <w:bookmarkEnd w:id="1"/>
     </w:p>
     <w:p>
       <w:pPr>
@@ -2636,7 +2858,127 @@
           <w:sz w:val="22"/>
           <w:szCs w:val="22"/>
         </w:rPr>
-        <w:t xml:space="preserve">Post the written summary in the Masar and Bukrah WhatsApp group in Arabic, using the template in section 6. Attach BF-R03, BF-T14, BF-T11, BF-T24, and BF-R04.</w:t>
+        <w:t xml:space="preserve">Post the written summary in the Masar and Bukrah WhatsApp group in Arabic, using the </w:t>
+      </w:r>
+      <w:hyperlink w:history="1" w:anchor="sec6">
+        <w:r>
+          <w:rPr>
+            <w:rFonts w:ascii="Times New Roman" w:cs="Times New Roman" w:eastAsia="Times New Roman" w:hAnsi="Times New Roman"/>
+            <w:color w:val="0563C1"/>
+            <w:sz w:val="22"/>
+            <w:szCs w:val="22"/>
+            <w:u w:val="single"/>
+          </w:rPr>
+          <w:t xml:space="preserve">template in section 6</w:t>
+        </w:r>
+      </w:hyperlink>
+      <w:r>
+        <w:rPr>
+          <w:rFonts w:ascii="Times New Roman" w:cs="Times New Roman" w:eastAsia="Times New Roman" w:hAnsi="Times New Roman"/>
+          <w:sz w:val="22"/>
+          <w:szCs w:val="22"/>
+        </w:rPr>
+        <w:t xml:space="preserve">. Attach </w:t>
+      </w:r>
+      <w:hyperlink w:history="1" r:id="rIdd8gvg0wi4hob9obl1any9">
+        <w:r>
+          <w:rPr>
+            <w:rFonts w:ascii="Times New Roman" w:cs="Times New Roman" w:eastAsia="Times New Roman" w:hAnsi="Times New Roman"/>
+            <w:color w:val="0563C1"/>
+            <w:sz w:val="22"/>
+            <w:szCs w:val="22"/>
+            <w:u w:val="single"/>
+          </w:rPr>
+          <w:t xml:space="preserve">BF-R03</w:t>
+        </w:r>
+      </w:hyperlink>
+      <w:r>
+        <w:rPr>
+          <w:rFonts w:ascii="Times New Roman" w:cs="Times New Roman" w:eastAsia="Times New Roman" w:hAnsi="Times New Roman"/>
+          <w:sz w:val="22"/>
+          <w:szCs w:val="22"/>
+        </w:rPr>
+        <w:t xml:space="preserve">, </w:t>
+      </w:r>
+      <w:hyperlink w:history="1" r:id="rIdourcyengwssxdfaagmdsh">
+        <w:r>
+          <w:rPr>
+            <w:rFonts w:ascii="Times New Roman" w:cs="Times New Roman" w:eastAsia="Times New Roman" w:hAnsi="Times New Roman"/>
+            <w:color w:val="0563C1"/>
+            <w:sz w:val="22"/>
+            <w:szCs w:val="22"/>
+            <w:u w:val="single"/>
+          </w:rPr>
+          <w:t xml:space="preserve">BF-T14</w:t>
+        </w:r>
+      </w:hyperlink>
+      <w:r>
+        <w:rPr>
+          <w:rFonts w:ascii="Times New Roman" w:cs="Times New Roman" w:eastAsia="Times New Roman" w:hAnsi="Times New Roman"/>
+          <w:sz w:val="22"/>
+          <w:szCs w:val="22"/>
+        </w:rPr>
+        <w:t xml:space="preserve">, </w:t>
+      </w:r>
+      <w:hyperlink w:history="1" r:id="rId3c1iqi_wdejbdzpsw8haa">
+        <w:r>
+          <w:rPr>
+            <w:rFonts w:ascii="Times New Roman" w:cs="Times New Roman" w:eastAsia="Times New Roman" w:hAnsi="Times New Roman"/>
+            <w:color w:val="0563C1"/>
+            <w:sz w:val="22"/>
+            <w:szCs w:val="22"/>
+            <w:u w:val="single"/>
+          </w:rPr>
+          <w:t xml:space="preserve">BF-T11</w:t>
+        </w:r>
+      </w:hyperlink>
+      <w:r>
+        <w:rPr>
+          <w:rFonts w:ascii="Times New Roman" w:cs="Times New Roman" w:eastAsia="Times New Roman" w:hAnsi="Times New Roman"/>
+          <w:sz w:val="22"/>
+          <w:szCs w:val="22"/>
+        </w:rPr>
+        <w:t xml:space="preserve">, </w:t>
+      </w:r>
+      <w:hyperlink w:history="1" r:id="rId7ivneurggzj9rg2onjer_">
+        <w:r>
+          <w:rPr>
+            <w:rFonts w:ascii="Times New Roman" w:cs="Times New Roman" w:eastAsia="Times New Roman" w:hAnsi="Times New Roman"/>
+            <w:color w:val="0563C1"/>
+            <w:sz w:val="22"/>
+            <w:szCs w:val="22"/>
+            <w:u w:val="single"/>
+          </w:rPr>
+          <w:t xml:space="preserve">BF-T24</w:t>
+        </w:r>
+      </w:hyperlink>
+      <w:r>
+        <w:rPr>
+          <w:rFonts w:ascii="Times New Roman" w:cs="Times New Roman" w:eastAsia="Times New Roman" w:hAnsi="Times New Roman"/>
+          <w:sz w:val="22"/>
+          <w:szCs w:val="22"/>
+        </w:rPr>
+        <w:t xml:space="preserve">, and </w:t>
+      </w:r>
+      <w:hyperlink w:history="1" r:id="rId1i5ealasrte50eiaqb-ag">
+        <w:r>
+          <w:rPr>
+            <w:rFonts w:ascii="Times New Roman" w:cs="Times New Roman" w:eastAsia="Times New Roman" w:hAnsi="Times New Roman"/>
+            <w:color w:val="0563C1"/>
+            <w:sz w:val="22"/>
+            <w:szCs w:val="22"/>
+            <w:u w:val="single"/>
+          </w:rPr>
+          <w:t xml:space="preserve">BF-R04</w:t>
+        </w:r>
+      </w:hyperlink>
+      <w:r>
+        <w:rPr>
+          <w:rFonts w:ascii="Times New Roman" w:cs="Times New Roman" w:eastAsia="Times New Roman" w:hAnsi="Times New Roman"/>
+          <w:sz w:val="22"/>
+          <w:szCs w:val="22"/>
+        </w:rPr>
+        <w:t xml:space="preserve">.</w:t>
       </w:r>
     </w:p>
     <w:p>
@@ -2657,7 +2999,27 @@
           <w:sz w:val="22"/>
           <w:szCs w:val="22"/>
         </w:rPr>
-        <w:t xml:space="preserve">Send Dr. Ahlia a short message: what he said Masar is owed, what he agreed to, the dates, and anything that contradicts what he told her on 10/05.</w:t>
+        <w:t xml:space="preserve">Send Dr. Ahlia a short message: what he said Masar is owed, what he agreed to, the dates, and anything that contradicts what he </w:t>
+      </w:r>
+      <w:hyperlink w:history="1" r:id="rId6xv5pcfgsbgsiuvcvrone">
+        <w:r>
+          <w:rPr>
+            <w:rFonts w:ascii="Times New Roman" w:cs="Times New Roman" w:eastAsia="Times New Roman" w:hAnsi="Times New Roman"/>
+            <w:color w:val="0563C1"/>
+            <w:sz w:val="22"/>
+            <w:szCs w:val="22"/>
+            <w:u w:val="single"/>
+          </w:rPr>
+          <w:t xml:space="preserve">told her on 10/05</w:t>
+        </w:r>
+      </w:hyperlink>
+      <w:r>
+        <w:rPr>
+          <w:rFonts w:ascii="Times New Roman" w:cs="Times New Roman" w:eastAsia="Times New Roman" w:hAnsi="Times New Roman"/>
+          <w:sz w:val="22"/>
+          <w:szCs w:val="22"/>
+        </w:rPr>
+        <w:t xml:space="preserve">.</w:t>
       </w:r>
     </w:p>
     <w:p>
@@ -2699,7 +3061,27 @@
           <w:sz w:val="22"/>
           <w:szCs w:val="22"/>
         </w:rPr>
-        <w:t xml:space="preserve">Put three reminders in your calendar: the next water delivery, to check for the first signed daily log. 10/18, the debt statement deadline. 10/19, the day BF-R03 comes into force.</w:t>
+        <w:t xml:space="preserve">Put three reminders in your calendar: the next water delivery, to check for the first signed daily log. 10/18, the debt statement deadline. 10/19, the day </w:t>
+      </w:r>
+      <w:hyperlink w:history="1" r:id="rIdspn2vvekpjz0wr4kypbhn">
+        <w:r>
+          <w:rPr>
+            <w:rFonts w:ascii="Times New Roman" w:cs="Times New Roman" w:eastAsia="Times New Roman" w:hAnsi="Times New Roman"/>
+            <w:color w:val="0563C1"/>
+            <w:sz w:val="22"/>
+            <w:szCs w:val="22"/>
+            <w:u w:val="single"/>
+          </w:rPr>
+          <w:t xml:space="preserve">BF-R03</w:t>
+        </w:r>
+      </w:hyperlink>
+      <w:r>
+        <w:rPr>
+          <w:rFonts w:ascii="Times New Roman" w:cs="Times New Roman" w:eastAsia="Times New Roman" w:hAnsi="Times New Roman"/>
+          <w:sz w:val="22"/>
+          <w:szCs w:val="22"/>
+        </w:rPr>
+        <w:t xml:space="preserve"> comes into force.</w:t>
       </w:r>
     </w:p>
     <w:p>
@@ -2720,7 +3102,47 @@
           <w:sz w:val="22"/>
           <w:szCs w:val="22"/>
         </w:rPr>
-        <w:t xml:space="preserve">If he gave a number for what Masar is owed, write it against the 10/02 statement and the evidence sheet before you forget his words. His own number on the call is your anchor for the next round.</w:t>
+        <w:t xml:space="preserve">If he gave a number for what Masar is owed, write it against the </w:t>
+      </w:r>
+      <w:hyperlink w:history="1" r:id="rIdpdx3hoyxqk03qopvnd5fo">
+        <w:r>
+          <w:rPr>
+            <w:rFonts w:ascii="Times New Roman" w:cs="Times New Roman" w:eastAsia="Times New Roman" w:hAnsi="Times New Roman"/>
+            <w:color w:val="0563C1"/>
+            <w:sz w:val="22"/>
+            <w:szCs w:val="22"/>
+            <w:u w:val="single"/>
+          </w:rPr>
+          <w:t xml:space="preserve">10/02 statement</w:t>
+        </w:r>
+      </w:hyperlink>
+      <w:r>
+        <w:rPr>
+          <w:rFonts w:ascii="Times New Roman" w:cs="Times New Roman" w:eastAsia="Times New Roman" w:hAnsi="Times New Roman"/>
+          <w:sz w:val="22"/>
+          <w:szCs w:val="22"/>
+        </w:rPr>
+        <w:t xml:space="preserve"> and the </w:t>
+      </w:r>
+      <w:hyperlink w:history="1" r:id="rIdxn0qdjd0ph9-jas2vkxz7">
+        <w:r>
+          <w:rPr>
+            <w:rFonts w:ascii="Times New Roman" w:cs="Times New Roman" w:eastAsia="Times New Roman" w:hAnsi="Times New Roman"/>
+            <w:color w:val="0563C1"/>
+            <w:sz w:val="22"/>
+            <w:szCs w:val="22"/>
+            <w:u w:val="single"/>
+          </w:rPr>
+          <w:t xml:space="preserve">evidence sheet</w:t>
+        </w:r>
+      </w:hyperlink>
+      <w:r>
+        <w:rPr>
+          <w:rFonts w:ascii="Times New Roman" w:cs="Times New Roman" w:eastAsia="Times New Roman" w:hAnsi="Times New Roman"/>
+          <w:sz w:val="22"/>
+          <w:szCs w:val="22"/>
+        </w:rPr>
+        <w:t xml:space="preserve"> before you forget his words. His own number on the call is your anchor for the next round.</w:t>
       </w:r>
     </w:p>
     <w:p>
@@ -2730,6 +3152,7 @@
         <w:widowControl/>
         <w:spacing w:after="120" w:before="240"/>
       </w:pPr>
+      <w:bookmarkStart w:name="sec6" w:id="1"/>
       <w:r>
         <w:rPr>
           <w:rFonts w:ascii="Times New Roman" w:cs="Times New Roman" w:eastAsia="Times New Roman" w:hAnsi="Times New Roman"/>
@@ -2740,6 +3163,7 @@
         </w:rPr>
         <w:t xml:space="preserve">6. WhatsApp follow up to post in the group</w:t>
       </w:r>
+      <w:bookmarkEnd w:id="1"/>
     </w:p>
     <w:p>
       <w:pPr>
@@ -3163,6 +3587,7 @@
         <w:widowControl/>
         <w:spacing w:after="120" w:before="240"/>
       </w:pPr>
+      <w:bookmarkStart w:name="sec7" w:id="1"/>
       <w:r>
         <w:rPr>
           <w:rFonts w:ascii="Times New Roman" w:cs="Times New Roman" w:eastAsia="Times New Roman" w:hAnsi="Times New Roman"/>
@@ -3173,6 +3598,7 @@
         </w:rPr>
         <w:t xml:space="preserve">7. Numbers card</w:t>
       </w:r>
+      <w:bookmarkEnd w:id="1"/>
     </w:p>
     <w:p>
       <w:pPr>
@@ -3188,7 +3614,47 @@
           <w:sz w:val="22"/>
           <w:szCs w:val="22"/>
         </w:rPr>
-        <w:t xml:space="preserve">Every figure comes from Masar's own documents or Bukrah's records, as set out in the Masar claim evidence sheet of 10/05/2026. Keep this page open during the call.</w:t>
+        <w:t xml:space="preserve">Every figure comes from Masar's own documents or Bukrah's records, as set out in the </w:t>
+      </w:r>
+      <w:hyperlink w:history="1" r:id="rId9wotkwcix-stx-ej3l4cg">
+        <w:r>
+          <w:rPr>
+            <w:rFonts w:ascii="Times New Roman" w:cs="Times New Roman" w:eastAsia="Times New Roman" w:hAnsi="Times New Roman"/>
+            <w:color w:val="0563C1"/>
+            <w:sz w:val="22"/>
+            <w:szCs w:val="22"/>
+            <w:u w:val="single"/>
+          </w:rPr>
+          <w:t xml:space="preserve">Masar claim evidence sheet of 10/05/2026</w:t>
+        </w:r>
+      </w:hyperlink>
+      <w:r>
+        <w:rPr>
+          <w:rFonts w:ascii="Times New Roman" w:cs="Times New Roman" w:eastAsia="Times New Roman" w:hAnsi="Times New Roman"/>
+          <w:sz w:val="22"/>
+          <w:szCs w:val="22"/>
+        </w:rPr>
+        <w:t xml:space="preserve">. The statement, letters, invoices and receipts themselves are in the </w:t>
+      </w:r>
+      <w:hyperlink w:history="1" r:id="rIdwar-vdu4w3dldbbrnbaz3">
+        <w:r>
+          <w:rPr>
+            <w:rFonts w:ascii="Times New Roman" w:cs="Times New Roman" w:eastAsia="Times New Roman" w:hAnsi="Times New Roman"/>
+            <w:color w:val="0563C1"/>
+            <w:sz w:val="22"/>
+            <w:szCs w:val="22"/>
+            <w:u w:val="single"/>
+          </w:rPr>
+          <w:t xml:space="preserve">evidence folder</w:t>
+        </w:r>
+      </w:hyperlink>
+      <w:r>
+        <w:rPr>
+          <w:rFonts w:ascii="Times New Roman" w:cs="Times New Roman" w:eastAsia="Times New Roman" w:hAnsi="Times New Roman"/>
+          <w:sz w:val="22"/>
+          <w:szCs w:val="22"/>
+        </w:rPr>
+        <w:t xml:space="preserve">. Keep this page open during the call.</w:t>
       </w:r>
     </w:p>
     <w:p>
@@ -4439,8 +4905,22 @@
           <w:sz w:val="22"/>
           <w:szCs w:val="22"/>
         </w:rPr>
-        <w:t xml:space="preserve">What Dr. Ahlia confirmed with Abu Hani on 10/05/2026</w:t>
-      </w:r>
+        <w:t xml:space="preserve">What Dr. Ahlia confirmed with Abu Hani, from the </w:t>
+      </w:r>
+      <w:hyperlink w:history="1" r:id="rIdownn4ubwxm26tleeibiqm">
+        <w:r>
+          <w:rPr>
+            <w:rFonts w:ascii="Times New Roman" w:cs="Times New Roman" w:eastAsia="Times New Roman" w:hAnsi="Times New Roman"/>
+            <w:b/>
+            <w:bCs/>
+            <w:color w:val="0563C1"/>
+            <w:sz w:val="22"/>
+            <w:szCs w:val="22"/>
+            <w:u w:val="single"/>
+          </w:rPr>
+          <w:t xml:space="preserve">call notes of 10/05/2026</w:t>
+        </w:r>
+      </w:hyperlink>
     </w:p>
     <w:p>
       <w:pPr>
@@ -4708,13 +5188,23 @@
             <w:r>
               <w:rPr>
                 <w:rFonts w:ascii="Times New Roman" w:cs="Times New Roman" w:eastAsia="Times New Roman" w:hAnsi="Times New Roman"/>
-                <w:b w:val="false"/>
-                <w:bCs w:val="false"/>
                 <w:sz w:val="22"/>
                 <w:szCs w:val="22"/>
               </w:rPr>
-              <w:t xml:space="preserve">School supplies, 175 kits, Al-Jinan School, BF-T22</w:t>
+              <w:t xml:space="preserve">School supplies, 175 kits, Al-Jinan School, </w:t>
             </w:r>
+            <w:hyperlink w:history="1" r:id="rIdjggsvzdtor4qpornsnkta">
+              <w:r>
+                <w:rPr>
+                  <w:rFonts w:ascii="Times New Roman" w:cs="Times New Roman" w:eastAsia="Times New Roman" w:hAnsi="Times New Roman"/>
+                  <w:color w:val="0563C1"/>
+                  <w:sz w:val="22"/>
+                  <w:szCs w:val="22"/>
+                  <w:u w:val="single"/>
+                </w:rPr>
+                <w:t xml:space="preserve">BF-T22</w:t>
+              </w:r>
+            </w:hyperlink>
           </w:p>
         </w:tc>
         <w:tc>
@@ -5001,16 +5491,18 @@
               <w:spacing w:after="0" w:line="240"/>
               <w:jc w:val="left"/>
             </w:pPr>
-            <w:r>
-              <w:rPr>
-                <w:rFonts w:ascii="Times New Roman" w:cs="Times New Roman" w:eastAsia="Times New Roman" w:hAnsi="Times New Roman"/>
-                <w:b w:val="false"/>
-                <w:bCs w:val="false"/>
-                <w:sz w:val="22"/>
-                <w:szCs w:val="22"/>
-              </w:rPr>
-              <w:t xml:space="preserve">BF-R03</w:t>
-            </w:r>
+            <w:hyperlink w:history="1" r:id="rIdk2_vqn5y0fkuossoobjn5">
+              <w:r>
+                <w:rPr>
+                  <w:rFonts w:ascii="Times New Roman" w:cs="Times New Roman" w:eastAsia="Times New Roman" w:hAnsi="Times New Roman"/>
+                  <w:color w:val="0563C1"/>
+                  <w:sz w:val="22"/>
+                  <w:szCs w:val="22"/>
+                  <w:u w:val="single"/>
+                </w:rPr>
+                <w:t xml:space="preserve">BF-R03</w:t>
+              </w:r>
+            </w:hyperlink>
           </w:p>
         </w:tc>
         <w:tc>
@@ -5067,16 +5559,18 @@
               <w:spacing w:after="0" w:line="240"/>
               <w:jc w:val="left"/>
             </w:pPr>
-            <w:r>
-              <w:rPr>
-                <w:rFonts w:ascii="Times New Roman" w:cs="Times New Roman" w:eastAsia="Times New Roman" w:hAnsi="Times New Roman"/>
-                <w:b w:val="false"/>
-                <w:bCs w:val="false"/>
-                <w:sz w:val="22"/>
-                <w:szCs w:val="22"/>
-              </w:rPr>
-              <w:t xml:space="preserve">BF-T14</w:t>
-            </w:r>
+            <w:hyperlink w:history="1" r:id="rId53qg9kegbinvtusk9bkdq">
+              <w:r>
+                <w:rPr>
+                  <w:rFonts w:ascii="Times New Roman" w:cs="Times New Roman" w:eastAsia="Times New Roman" w:hAnsi="Times New Roman"/>
+                  <w:color w:val="0563C1"/>
+                  <w:sz w:val="22"/>
+                  <w:szCs w:val="22"/>
+                  <w:u w:val="single"/>
+                </w:rPr>
+                <w:t xml:space="preserve">BF-T14</w:t>
+              </w:r>
+            </w:hyperlink>
           </w:p>
         </w:tc>
         <w:tc>
@@ -5133,16 +5627,18 @@
               <w:spacing w:after="0" w:line="240"/>
               <w:jc w:val="left"/>
             </w:pPr>
-            <w:r>
-              <w:rPr>
-                <w:rFonts w:ascii="Times New Roman" w:cs="Times New Roman" w:eastAsia="Times New Roman" w:hAnsi="Times New Roman"/>
-                <w:b w:val="false"/>
-                <w:bCs w:val="false"/>
-                <w:sz w:val="22"/>
-                <w:szCs w:val="22"/>
-              </w:rPr>
-              <w:t xml:space="preserve">BF-T11</w:t>
-            </w:r>
+            <w:hyperlink w:history="1" r:id="rIdt-qkuzgomexmrkxz2s8eb">
+              <w:r>
+                <w:rPr>
+                  <w:rFonts w:ascii="Times New Roman" w:cs="Times New Roman" w:eastAsia="Times New Roman" w:hAnsi="Times New Roman"/>
+                  <w:color w:val="0563C1"/>
+                  <w:sz w:val="22"/>
+                  <w:szCs w:val="22"/>
+                  <w:u w:val="single"/>
+                </w:rPr>
+                <w:t xml:space="preserve">BF-T11</w:t>
+              </w:r>
+            </w:hyperlink>
           </w:p>
         </w:tc>
         <w:tc>
@@ -5199,16 +5695,18 @@
               <w:spacing w:after="0" w:line="240"/>
               <w:jc w:val="left"/>
             </w:pPr>
-            <w:r>
-              <w:rPr>
-                <w:rFonts w:ascii="Times New Roman" w:cs="Times New Roman" w:eastAsia="Times New Roman" w:hAnsi="Times New Roman"/>
-                <w:b w:val="false"/>
-                <w:bCs w:val="false"/>
-                <w:sz w:val="22"/>
-                <w:szCs w:val="22"/>
-              </w:rPr>
-              <w:t xml:space="preserve">BF-T24</w:t>
-            </w:r>
+            <w:hyperlink w:history="1" r:id="rIdrn55pqmz_fu-4lzaldcop">
+              <w:r>
+                <w:rPr>
+                  <w:rFonts w:ascii="Times New Roman" w:cs="Times New Roman" w:eastAsia="Times New Roman" w:hAnsi="Times New Roman"/>
+                  <w:color w:val="0563C1"/>
+                  <w:sz w:val="22"/>
+                  <w:szCs w:val="22"/>
+                  <w:u w:val="single"/>
+                </w:rPr>
+                <w:t xml:space="preserve">BF-T24</w:t>
+              </w:r>
+            </w:hyperlink>
           </w:p>
         </w:tc>
         <w:tc>
@@ -5265,16 +5763,18 @@
               <w:spacing w:after="0" w:line="240"/>
               <w:jc w:val="left"/>
             </w:pPr>
-            <w:r>
-              <w:rPr>
-                <w:rFonts w:ascii="Times New Roman" w:cs="Times New Roman" w:eastAsia="Times New Roman" w:hAnsi="Times New Roman"/>
-                <w:b w:val="false"/>
-                <w:bCs w:val="false"/>
-                <w:sz w:val="22"/>
-                <w:szCs w:val="22"/>
-              </w:rPr>
-              <w:t xml:space="preserve">BF-R04</w:t>
-            </w:r>
+            <w:hyperlink w:history="1" r:id="rIdtmdwuim3u9hzy3ab11qkt">
+              <w:r>
+                <w:rPr>
+                  <w:rFonts w:ascii="Times New Roman" w:cs="Times New Roman" w:eastAsia="Times New Roman" w:hAnsi="Times New Roman"/>
+                  <w:color w:val="0563C1"/>
+                  <w:sz w:val="22"/>
+                  <w:szCs w:val="22"/>
+                  <w:u w:val="single"/>
+                </w:rPr>
+                <w:t xml:space="preserve">BF-R04</w:t>
+              </w:r>
+            </w:hyperlink>
           </w:p>
         </w:tc>
         <w:tc>
@@ -5325,7 +5825,39 @@
           </w:tcPr>
           <w:p>
             <w:pPr>
-              <w:keepNext w:val="false"/>
+              <w:keepNext/>
+              <w:keepLines/>
+              <w:widowControl/>
+              <w:spacing w:after="0" w:line="240"/>
+              <w:jc w:val="left"/>
+            </w:pPr>
+            <w:hyperlink w:history="1" r:id="rIdowntg7gdmb2zgsiklu8co">
+              <w:r>
+                <w:rPr>
+                  <w:rFonts w:ascii="Times New Roman" w:cs="Times New Roman" w:eastAsia="Times New Roman" w:hAnsi="Times New Roman"/>
+                  <w:color w:val="0563C1"/>
+                  <w:sz w:val="22"/>
+                  <w:szCs w:val="22"/>
+                  <w:u w:val="single"/>
+                </w:rPr>
+                <w:t xml:space="preserve">BF-T10</w:t>
+              </w:r>
+            </w:hyperlink>
+          </w:p>
+        </w:tc>
+        <w:tc>
+          <w:tcPr>
+            <w:tcW w:type="dxa" w:w="7560"/>
+            <w:tcMar>
+              <w:top w:type="dxa" w:w="60"/>
+              <w:left w:type="dxa" w:w="90"/>
+              <w:bottom w:type="dxa" w:w="60"/>
+              <w:right w:type="dxa" w:w="90"/>
+            </w:tcMar>
+          </w:tcPr>
+          <w:p>
+            <w:pPr>
+              <w:keepNext/>
               <w:keepLines/>
               <w:widowControl/>
               <w:spacing w:after="0" w:line="240"/>
@@ -5339,8 +5871,46 @@
                 <w:sz w:val="22"/>
                 <w:szCs w:val="22"/>
               </w:rPr>
-              <w:t xml:space="preserve">BF-T10</w:t>
+              <w:t xml:space="preserve">Receipt Voucher. One for every transfer received.</w:t>
             </w:r>
+          </w:p>
+        </w:tc>
+      </w:tr>
+      <w:tr>
+        <w:trPr>
+          <w:cantSplit/>
+          <w:tblHeader w:val="false"/>
+        </w:trPr>
+        <w:tc>
+          <w:tcPr>
+            <w:tcW w:type="dxa" w:w="1800"/>
+            <w:tcMar>
+              <w:top w:type="dxa" w:w="60"/>
+              <w:left w:type="dxa" w:w="90"/>
+              <w:bottom w:type="dxa" w:w="60"/>
+              <w:right w:type="dxa" w:w="90"/>
+            </w:tcMar>
+          </w:tcPr>
+          <w:p>
+            <w:pPr>
+              <w:keepNext w:val="false"/>
+              <w:keepLines/>
+              <w:widowControl/>
+              <w:spacing w:after="0" w:line="240"/>
+              <w:jc w:val="left"/>
+            </w:pPr>
+            <w:hyperlink w:history="1" r:id="rIduak6jxgwkmvwe0rx7gtlf">
+              <w:r>
+                <w:rPr>
+                  <w:rFonts w:ascii="Times New Roman" w:cs="Times New Roman" w:eastAsia="Times New Roman" w:hAnsi="Times New Roman"/>
+                  <w:color w:val="0563C1"/>
+                  <w:sz w:val="22"/>
+                  <w:szCs w:val="22"/>
+                  <w:u w:val="single"/>
+                </w:rPr>
+                <w:t xml:space="preserve">BF-T25</w:t>
+              </w:r>
+            </w:hyperlink>
           </w:p>
         </w:tc>
         <w:tc>
@@ -5369,7 +5939,7 @@
                 <w:sz w:val="22"/>
                 <w:szCs w:val="22"/>
               </w:rPr>
-              <w:t xml:space="preserve">Receipt Voucher. One for every transfer received.</w:t>
+              <w:t xml:space="preserve">Vendor and Contractor List. Every supplier Masar pays with Bukrah money, for OFAC (Office of Foreign Assets Control) screening.</w:t>
             </w:r>
           </w:p>
         </w:tc>
@@ -5381,8 +5951,226 @@
         <w:keepLines/>
         <w:pageBreakBefore/>
         <w:widowControl/>
+        <w:spacing w:after="60"/>
+      </w:pPr>
+      <w:r>
+        <w:rPr>
+          <w:rFonts w:ascii="Times New Roman" w:cs="Times New Roman" w:eastAsia="Times New Roman" w:hAnsi="Times New Roman"/>
+          <w:b/>
+          <w:bCs/>
+          <w:sz w:val="22"/>
+          <w:szCs w:val="22"/>
+        </w:rPr>
+        <w:t xml:space="preserve">Sources behind this script</w:t>
+      </w:r>
+    </w:p>
+    <w:p>
+      <w:pPr>
+        <w:pStyle w:val="ListParagraph"/>
+        <w:keepNext/>
+        <w:keepLines/>
+        <w:widowControl/>
+        <w:numPr>
+          <w:ilvl w:val="0"/>
+          <w:numId w:val="3"/>
+        </w:numPr>
+        <w:spacing w:after="60" w:line="276"/>
+      </w:pPr>
+      <w:hyperlink w:history="1" r:id="rIdhxnaf6ntgkpoutsgxquqb">
+        <w:r>
+          <w:rPr>
+            <w:rFonts w:ascii="Times New Roman" w:cs="Times New Roman" w:eastAsia="Times New Roman" w:hAnsi="Times New Roman"/>
+            <w:color w:val="0563C1"/>
+            <w:sz w:val="22"/>
+            <w:szCs w:val="22"/>
+            <w:u w:val="single"/>
+          </w:rPr>
+          <w:t xml:space="preserve">Masar claim evidence sheet for Dr. Ahlia, 10/05/2026</w:t>
+        </w:r>
+      </w:hyperlink>
+      <w:r>
+        <w:rPr>
+          <w:rFonts w:ascii="Times New Roman" w:cs="Times New Roman" w:eastAsia="Times New Roman" w:hAnsi="Times New Roman"/>
+          <w:sz w:val="22"/>
+          <w:szCs w:val="22"/>
+        </w:rPr>
+        <w:t xml:space="preserve">. Every number in this script, with Masar's documents in English.</w:t>
+      </w:r>
+    </w:p>
+    <w:p>
+      <w:pPr>
+        <w:pStyle w:val="ListParagraph"/>
+        <w:keepNext/>
+        <w:keepLines/>
+        <w:widowControl/>
+        <w:numPr>
+          <w:ilvl w:val="0"/>
+          <w:numId w:val="3"/>
+        </w:numPr>
+        <w:spacing w:after="60" w:line="276"/>
+      </w:pPr>
+      <w:hyperlink w:history="1" r:id="rIdc_1_1tn28rze5l6cxbbf9">
+        <w:r>
+          <w:rPr>
+            <w:rFonts w:ascii="Times New Roman" w:cs="Times New Roman" w:eastAsia="Times New Roman" w:hAnsi="Times New Roman"/>
+            <w:color w:val="0563C1"/>
+            <w:sz w:val="22"/>
+            <w:szCs w:val="22"/>
+            <w:u w:val="single"/>
+          </w:rPr>
+          <w:t xml:space="preserve">Masar evidence folder</w:t>
+        </w:r>
+      </w:hyperlink>
+      <w:r>
+        <w:rPr>
+          <w:rFonts w:ascii="Times New Roman" w:cs="Times New Roman" w:eastAsia="Times New Roman" w:hAnsi="Times New Roman"/>
+          <w:sz w:val="22"/>
+          <w:szCs w:val="22"/>
+        </w:rPr>
+        <w:t xml:space="preserve">. The 10/02 debt statement, cover letter, invoices, receipt vouchers and the October water log photo.</w:t>
+      </w:r>
+    </w:p>
+    <w:p>
+      <w:pPr>
+        <w:pStyle w:val="ListParagraph"/>
+        <w:keepNext/>
+        <w:keepLines/>
+        <w:widowControl/>
+        <w:numPr>
+          <w:ilvl w:val="0"/>
+          <w:numId w:val="3"/>
+        </w:numPr>
+        <w:spacing w:after="60" w:line="276"/>
+      </w:pPr>
+      <w:hyperlink w:history="1" r:id="rIddq30ye6muss5nalle4gq_">
+        <w:r>
+          <w:rPr>
+            <w:rFonts w:ascii="Times New Roman" w:cs="Times New Roman" w:eastAsia="Times New Roman" w:hAnsi="Times New Roman"/>
+            <w:color w:val="0563C1"/>
+            <w:sz w:val="22"/>
+            <w:szCs w:val="22"/>
+            <w:u w:val="single"/>
+          </w:rPr>
+          <w:t xml:space="preserve">Call notes, Dr. Ahlia and Mohammad, 10/05/2026</w:t>
+        </w:r>
+      </w:hyperlink>
+      <w:r>
+        <w:rPr>
+          <w:rFonts w:ascii="Times New Roman" w:cs="Times New Roman" w:eastAsia="Times New Roman" w:hAnsi="Times New Roman"/>
+          <w:sz w:val="22"/>
+          <w:szCs w:val="22"/>
+        </w:rPr>
+        <w:t xml:space="preserve">. What Abu Hani told Dr. Ahlia is owed, and the hold on the October water.</w:t>
+      </w:r>
+    </w:p>
+    <w:p>
+      <w:pPr>
+        <w:pStyle w:val="ListParagraph"/>
+        <w:keepNext/>
+        <w:keepLines/>
+        <w:widowControl/>
+        <w:numPr>
+          <w:ilvl w:val="0"/>
+          <w:numId w:val="3"/>
+        </w:numPr>
+        <w:spacing w:after="60" w:line="276"/>
+      </w:pPr>
+      <w:hyperlink w:history="1" r:id="rIditmthp7f1vx1dbsq6sbmw">
+        <w:r>
+          <w:rPr>
+            <w:rFonts w:ascii="Times New Roman" w:cs="Times New Roman" w:eastAsia="Times New Roman" w:hAnsi="Times New Roman"/>
+            <w:color w:val="0563C1"/>
+            <w:sz w:val="22"/>
+            <w:szCs w:val="22"/>
+            <w:u w:val="single"/>
+          </w:rPr>
+          <w:t xml:space="preserve">Call notes, Dr. Ahlia and Mohammad, 10/08/2026</w:t>
+        </w:r>
+      </w:hyperlink>
+      <w:r>
+        <w:rPr>
+          <w:rFonts w:ascii="Times New Roman" w:cs="Times New Roman" w:eastAsia="Times New Roman" w:hAnsi="Times New Roman"/>
+          <w:sz w:val="22"/>
+          <w:szCs w:val="22"/>
+        </w:rPr>
+        <w:t xml:space="preserve">. The decision to keep working with Masar against before and after evidence, with Mohammad holding the money talk.</w:t>
+      </w:r>
+    </w:p>
+    <w:p>
+      <w:pPr>
+        <w:pStyle w:val="ListParagraph"/>
+        <w:keepNext/>
+        <w:keepLines/>
+        <w:widowControl/>
+        <w:numPr>
+          <w:ilvl w:val="0"/>
+          <w:numId w:val="3"/>
+        </w:numPr>
+        <w:spacing w:after="60" w:line="276"/>
+      </w:pPr>
+      <w:hyperlink w:history="1" r:id="rIdfiheoffssbadyyynqvkqc">
+        <w:r>
+          <w:rPr>
+            <w:rFonts w:ascii="Times New Roman" w:cs="Times New Roman" w:eastAsia="Times New Roman" w:hAnsi="Times New Roman"/>
+            <w:color w:val="0563C1"/>
+            <w:sz w:val="22"/>
+            <w:szCs w:val="22"/>
+            <w:u w:val="single"/>
+          </w:rPr>
+          <w:t xml:space="preserve">Masar Youth Center June 2026 audit report</w:t>
+        </w:r>
+      </w:hyperlink>
+      <w:r>
+        <w:rPr>
+          <w:rFonts w:ascii="Times New Roman" w:cs="Times New Roman" w:eastAsia="Times New Roman" w:hAnsi="Times New Roman"/>
+          <w:sz w:val="22"/>
+          <w:szCs w:val="22"/>
+        </w:rPr>
+        <w:t xml:space="preserve">. The Hands of Mercy review of Masar, including the water tank bids.</w:t>
+      </w:r>
+    </w:p>
+    <w:p>
+      <w:pPr>
+        <w:pStyle w:val="ListParagraph"/>
+        <w:keepNext w:val="false"/>
+        <w:keepLines/>
+        <w:widowControl/>
+        <w:numPr>
+          <w:ilvl w:val="0"/>
+          <w:numId w:val="3"/>
+        </w:numPr>
+        <w:spacing w:after="60" w:line="276"/>
+      </w:pPr>
+      <w:hyperlink w:history="1" r:id="rIdkunxxouxwtwgt6yipktti">
+        <w:r>
+          <w:rPr>
+            <w:rFonts w:ascii="Times New Roman" w:cs="Times New Roman" w:eastAsia="Times New Roman" w:hAnsi="Times New Roman"/>
+            <w:color w:val="0563C1"/>
+            <w:sz w:val="22"/>
+            <w:szCs w:val="22"/>
+            <w:u w:val="single"/>
+          </w:rPr>
+          <w:t xml:space="preserve">Bukrah Live Dashboard</w:t>
+        </w:r>
+      </w:hyperlink>
+      <w:r>
+        <w:rPr>
+          <w:rFonts w:ascii="Times New Roman" w:cs="Times New Roman" w:eastAsia="Times New Roman" w:hAnsi="Times New Roman"/>
+          <w:sz w:val="22"/>
+          <w:szCs w:val="22"/>
+        </w:rPr>
+        <w:t xml:space="preserve">. Open requests, wires matched to the tracker, and the Masar flags.</w:t>
+      </w:r>
+    </w:p>
+    <w:p>
+      <w:pPr>
+        <w:keepNext/>
+        <w:keepLines/>
+        <w:pageBreakBefore/>
+        <w:widowControl/>
         <w:spacing w:after="120" w:before="240"/>
       </w:pPr>
+      <w:bookmarkStart w:name="sec8" w:id="1"/>
       <w:r>
         <w:rPr>
           <w:rFonts w:ascii="Times New Roman" w:cs="Times New Roman" w:eastAsia="Times New Roman" w:hAnsi="Times New Roman"/>
@@ -5393,6 +6181,7 @@
         </w:rPr>
         <w:t xml:space="preserve">8. Call notes</w:t>
       </w:r>
+      <w:bookmarkEnd w:id="1"/>
     </w:p>
     <w:p>
       <w:pPr>

</xml_diff>